<commit_message>
Remove continue with google
</commit_message>
<xml_diff>
--- a/Screenshoots&documents/EngineIQ_Documentation.docx
+++ b/Screenshoots&documents/EngineIQ_Documentation.docx
@@ -660,7 +660,7 @@
         <w:spacing w:before="80" w:after="80"/>
       </w:pPr>
       <w:r>
-        <w:t>User interface: A secure web dashboard features full user authentication—supporting both standard email/password logins and Google OAuth—to display real-time sensor streams and live anomaly alerts.</w:t>
+        <w:t xml:space="preserve">User interface: A secure web dashboard features full user authentication — email and password registration with mandatory email confirmation, sign-in by either email address or full name, and self-service password reset — to display real-time sensor streams and live anomaly alerts.</w:t>
       </w:r>
     </w:p>
     <w:p>
@@ -1410,7 +1410,7 @@
                 <w:sz w:val="20"/>
                 <w:szCs w:val="20"/>
               </w:rPr>
-              <w:t>Dashboard, Auth &amp; System Integration — Streamlit, Supabase Auth, Google OAuth, BLE integration.</w:t>
+              <w:t xml:space="preserve">Dashboard, Auth &amp; System Integration — Streamlit, Supabase Auth, email confirmation and password reset, BLE integration.</w:t>
             </w:r>
             <w:proofErr w:type="spellStart"/>
             <w:r>
@@ -1680,7 +1680,7 @@
         <w:spacing w:before="80" w:after="80"/>
       </w:pPr>
       <w:r>
-        <w:t>Secure web interface: A front-end web portal featuring email/password and Google OAuth authentication, hosted directly on GitHub Pages.</w:t>
+        <w:t xml:space="preserve">Secure web interface: A front-end web portal featuring email and password authentication with email confirmation and password reset, hosted directly on GitHub Pages.</w:t>
       </w:r>
     </w:p>
     <w:p>
@@ -3049,7 +3049,7 @@
         <w:jc w:val="both"/>
       </w:pPr>
       <w:r>
-        <w:t>The entire system relies on an integrated edge-to-device IoT architecture. At the edge, an ESP32 microcontroller interfaces directly with the hardware sensors, sampling the MPU6050 accelerometer at 50Hz and the DS18B20 temperature probe at 1Hz. This raw telemetry is transmitted over Bluetooth Low Energy (BLE) directly to a connected laptop running the Python inference engine. The backend processes all signal preprocessing and machine learning inference. Whenever the system flags an operational anomaly, it pushes the alert event to a cloud database and updates the web-based monitoring dashboard simultaneously. Dashboard access is restricted by a Supabase Auth gateway, which handles user sign-ups through mandatory verification emails as well as standard Google OAuth logins.</w:t>
+        <w:t xml:space="preserve">The entire system relies on an integrated edge-to-device IoT architecture. At the edge, an ESP32 microcontroller interfaces directly with the hardware sensors, sampling the MPU6050 accelerometer at 50Hz and the DS18B20 temperature probe at 1Hz. This raw telemetry is transmitted over Bluetooth Low Energy (BLE) directly to a connected laptop running the Python inference engine. The backend processes all signal preprocessing and machine learning inference. Whenever the system flags an operational anomaly, it pushes the alert event to a cloud database and updates the web-based monitoring dashboard simultaneously. Dashboard access is restricted by a Supabase Auth gateway, which requires every account to be registered with an email address and activated through a mandatory confirmation email before the dashboard can be reached.</w:t>
       </w:r>
       <w:proofErr w:type="spellStart"/>
       <w:r/>
@@ -3287,27 +3287,27 @@
       </w:pPr>
       <w:proofErr w:type="spellStart"/>
       <w:r>
-        <w:t>Supabase</w:t>
+        <w:t xml:space="preserve">Supabase is an open-source Firebase alternative built on PostgreSQL. It provides a managed cloud database with auto-generated REST APIs and a complete user authentication service. Supabase Auth supports email and password authentication with email confirmation, password recovery by one-time code, and JWT-based session management. In the proposed system, Supabase Auth secures the project website — users must register and confirm their email address before accessing the monitoring dashboard. The profiles table stores user full names and emails to support name-based login.</w:t>
       </w:r>
       <w:proofErr w:type="spellEnd"/>
       <w:r>
-        <w:t xml:space="preserve"> is an open-source Firebase alternative built on PostgreSQL. It provides a managed cloud database with auto-generated REST APIs and a complete user authentication service. </w:t>
+        <w:t xml:space="preserve"/>
       </w:r>
       <w:proofErr w:type="spellStart"/>
       <w:r>
-        <w:t>Supabase</w:t>
+        <w:t/>
       </w:r>
       <w:proofErr w:type="spellEnd"/>
       <w:r>
-        <w:t xml:space="preserve"> Auth supports email/password authentication with email confirmation, Google OAuth 2.0, and JWT-based session management. In the proposed system, </w:t>
+        <w:t xml:space="preserve"/>
       </w:r>
       <w:proofErr w:type="spellStart"/>
       <w:r>
-        <w:t>Supabase</w:t>
+        <w:t/>
       </w:r>
       <w:proofErr w:type="spellEnd"/>
       <w:r>
-        <w:t xml:space="preserve"> Auth secures the project website — users must register and confirm their email before accessing the monitoring dashboard. The profiles table stores user full names and emails to support name-based login.</w:t>
+        <w:t xml:space="preserve"/>
       </w:r>
     </w:p>
     <w:p>
@@ -3443,15 +3443,15 @@
         <w:spacing w:before="80" w:after="80"/>
       </w:pPr>
       <w:r>
-        <w:t xml:space="preserve">User Authentication: The project website is secured with </w:t>
+        <w:t xml:space="preserve">User Authentication: The project website is secured with Supabase Auth. Users must register and confirm their email address before accessing the dashboard, and can recover a forgotten password through a self-service reset flow without administrator involvement.</w:t>
       </w:r>
       <w:proofErr w:type="spellStart"/>
       <w:r>
-        <w:t>Supabase</w:t>
+        <w:t/>
       </w:r>
       <w:proofErr w:type="spellEnd"/>
       <w:r>
-        <w:t xml:space="preserve"> Auth. Users must register and confirm their email before accessing the dashboard. Google OAuth is provided as an alternative sign-in method.</w:t>
+        <w:t xml:space="preserve"/>
       </w:r>
     </w:p>
     <w:p>
@@ -5355,7 +5355,7 @@
                 <w:sz w:val="20"/>
                 <w:szCs w:val="20"/>
               </w:rPr>
-              <w:t>The system shall provide a 'Continue with Google' OAuth option on both Sign In and Create Account screens.</w:t>
+              <w:t xml:space="preserve">The website shall allow a user who has forgotten their password to request a reset by email, and to set a new password after verifying a single-use code or reset link.</w:t>
             </w:r>
           </w:p>
         </w:tc>
@@ -5666,7 +5666,7 @@
         <w:jc w:val="both"/>
       </w:pPr>
       <w:r>
-        <w:t>The front-end use case diagram captures interactions between two actor types and the web-based system. The New User actor interacts with four authentication use cases: Register Account, Confirm Email Address, Resend Confirmation Email, and Sign In with Google. The Registered Vehicle Owner actor interacts with: Sign In (email or name), View Real-Time Vibration Chart, View Real-Time Temperature Chart, Receive Anomaly Alert Notification, View Anomaly Severity Status, View Anomaly History Log, and Sign Out.</w:t>
+        <w:t xml:space="preserve">The front-end use case diagram captures interactions between two actor types and the web-based system. The New User actor interacts with four authentication use cases: Register Account, Confirm Email Address, Resend Confirmation Email, and Reset Forgotten Password. The Registered Vehicle Owner actor interacts with: Sign In (email or name), View Real-Time Vibration Chart, View Real-Time Temperature Chart, Receive Anomaly Alert Notification, View Anomaly Severity Status, View Anomaly History Log, and Sign Out.</w:t>
       </w:r>
     </w:p>
     <w:p>
@@ -7442,7 +7442,7 @@
                 <w:sz w:val="20"/>
                 <w:szCs w:val="20"/>
               </w:rPr>
-              <w:t>Sign In with Google</w:t>
+              <w:t xml:space="preserve">Reset Forgotten Password</w:t>
             </w:r>
           </w:p>
         </w:tc>
@@ -7496,7 +7496,7 @@
                 <w:sz w:val="20"/>
                 <w:szCs w:val="20"/>
               </w:rPr>
-              <w:t xml:space="preserve">The user clicks Continue with Google. The browser redirects to Google's OAuth consent screen. After approval, </w:t>
+              <w:t xml:space="preserve">The user selects 'Forgot your password?' and submits the email address registered to the account. Supabase sends a recovery email containing a single-use six-digit code and an equivalent reset link. The user either enters the code on the site or opens the link, and on successful verification is presented with a form to choose a new password, which is validated against the same strength rules applied at registration.</w:t>
             </w:r>
             <w:proofErr w:type="spellStart"/>
             <w:r>
@@ -7504,7 +7504,7 @@
                 <w:sz w:val="20"/>
                 <w:szCs w:val="20"/>
               </w:rPr>
-              <w:t>Supabase</w:t>
+              <w:t/>
             </w:r>
             <w:proofErr w:type="spellEnd"/>
             <w:r>
@@ -7512,7 +7512,7 @@
                 <w:sz w:val="20"/>
                 <w:szCs w:val="20"/>
               </w:rPr>
-              <w:t xml:space="preserve"> creates or retrieves the account, issues a JWT session, and redirects the user to the dashboard.</w:t>
+              <w:t xml:space="preserve"/>
             </w:r>
           </w:p>
         </w:tc>
@@ -8311,7 +8311,7 @@
         <w:jc w:val="both"/>
       </w:pPr>
       <w:r>
-        <w:t xml:space="preserve">The authentication flow diagram illustrates how users access the system. On visiting the site, an active session check is performed. If a valid JWT session exists, the user is taken directly to the dashboard. If not, the authentication screen is displayed. The user may choose email/password (a new user signs up and confirms their email address; a returning user signs in by email or full name) or Google OAuth. In both cases the browser is returned to an explicitly registered redirect URL — the deployed application path, which must appear in the Supabase project's redirect allow-list — where the application exchanges the returned authorisation code for a session using the PKCE flow. A redirect target that has not been allow-listed is silently replaced by the project's default Site URL, so the two values must be kept consistent with the deployed application path. All pathways result in a JWT session being established, after which the dashboard is displayed.</w:t>
+        <w:t xml:space="preserve">The authentication flow diagram illustrates how users access the system. On visiting the site, an active session check is performed. If a valid JWT session exists, the user is taken directly to the dashboard. If not, the authentication screen is displayed. A new user registers and must confirm their email address before the account can be used; a returning user signs in with either their email address or their full name together with their password. A user who has forgotten their password requests a recovery email and regains access by entering the single-use code it contains, or by opening the reset link. Confirmation and recovery links both return the browser to an explicitly registered redirect URL — the deployed application path, which must appear in the Supabase project's redirect allow-list — where the application exchanges the returned authorisation code for a session using the PKCE flow. A redirect target that has not been allow-listed is silently replaced by the project's default Site URL, so the two values must be kept consistent with the deployed application path. All pathways result in a JWT session being established, after which the dashboard is displayed.</w:t>
       </w:r>
     </w:p>
     <w:p>
@@ -9577,7 +9577,7 @@
         <w:spacing w:before="80" w:after="80"/>
       </w:pPr>
       <w:r>
-        <w:t xml:space="preserve">User Authentication — Google OAuth: The system integrates Google OAuth 2.0 using the PKCE authorisation-code flow. Google verifies the user's identity and returns an authorisation code to the Supabase callback endpoint, which then redirects to an allow-listed application URL where the client exchanges the code for a JWT session. Because the PKCE code verifier is held in the browser that began the sign-in, the exchange must complete in that same browser. No password is required or stored for Google-authenticated users.</w:t>
+        <w:t xml:space="preserve">User Authentication — Password Recovery: A user who has forgotten their password can request a recovery email without administrator involvement. Supabase issues a single-use token, delivered both as a six-digit code and as an equivalent reset link, which is valid for one hour and is invalidated once used. Possession of the registered mailbox is therefore the sole proof of identity accepted for a reset, and the new password is validated against the same minimum length and special-character rules enforced at registration, so recovery cannot be used to weaken an account's credentials.</w:t>
       </w:r>
       <w:proofErr w:type="spellStart"/>
       <w:r>
@@ -9879,7 +9879,7 @@
         <w:jc w:val="both"/>
       </w:pPr>
       <w:r>
-        <w:t>Authentication Screen Wireframe: The authentication screen presents a Sign In tab (email or name identifier field, password field with eye toggle, Continue with Google button) and a Create Account tab (full name, email, password with strength bar, confirm password with match indicator, Continue with Google button). After successful signup, the form is replaced by a confirmation panel showing the destination email, a 1-hour expiry warning, and a resend button with 60-second countdown.</w:t>
+        <w:t xml:space="preserve">Authentication Screen Wireframe: The authentication screen presents a Sign In tab (email or name identifier field, password field with eye toggle, and a 'Forgot your password?' link) and a Create Account tab (full name, email, password with strength bar, confirm password with match indicator). After successful signup, the form is replaced by a confirmation panel showing the destination email, a 1-hour expiry warning, and a resend button with 60-second countdown. Selecting the password link replaces the form with a three-stage recovery panel: email entry, six-digit code entry, and new-password entry with the same strength and match indicators used at registration.</w:t>
       </w:r>
     </w:p>
     <w:tbl>
@@ -12585,27 +12585,27 @@
       </w:pPr>
       <w:proofErr w:type="spellStart"/>
       <w:r>
-        <w:t>Supabase</w:t>
+        <w:t xml:space="preserve">Supabase: Used as the backend database and authentication service. Supabase Auth handles user registration, email confirmation, password recovery, and JWT session management. The supabase-py Python client inserts anomaly records and retrieves historical data for the dashboard.</w:t>
       </w:r>
       <w:proofErr w:type="spellEnd"/>
       <w:r>
-        <w:t xml:space="preserve">: Used as the backend database and authentication service. </w:t>
+        <w:t xml:space="preserve"/>
       </w:r>
       <w:proofErr w:type="spellStart"/>
       <w:r>
-        <w:t>Supabase</w:t>
+        <w:t/>
       </w:r>
       <w:proofErr w:type="spellEnd"/>
       <w:r>
-        <w:t xml:space="preserve"> Auth handles user registration, email confirmation, Google OAuth, and JWT session management. The </w:t>
+        <w:t xml:space="preserve"/>
       </w:r>
       <w:proofErr w:type="spellStart"/>
       <w:r>
-        <w:t>supabase-py</w:t>
+        <w:t/>
       </w:r>
       <w:proofErr w:type="spellEnd"/>
       <w:r>
-        <w:t xml:space="preserve"> Python client inserts anomaly records and retrieves historical data for the dashboard.</w:t>
+        <w:t xml:space="preserve"/>
       </w:r>
     </w:p>
     <w:p>
@@ -12669,7 +12669,7 @@
         <w:jc w:val="both"/>
       </w:pPr>
       <w:r>
-        <w:t>This chapter details the technical methodology, mapping twenty functional and eight non-functional requirements across five stakeholder types, including six specific authentication requirements (FR-14 to FR-19) and one new auto-detection requirement (FR-20). The communication protocol was updated from Wi-Fi/MQTT to Bluetooth Low Energy (BLE), reflecting the supervisor's recommendation to remove the Wi-Fi dependency and enable monitoring anywhere within Bluetooth range. The security architecture now utilises BLE UUID-based access control, Supabase RLS, JWT, HTTPS, and OAuth 2.0. The Agile development framework is maintained. Logical designs include an updated ERD, UI wireframes, and a Supabase database schema. Chapter 4 will present the physical implementation of these designs.</w:t>
+        <w:t xml:space="preserve">This chapter details the technical methodology, mapping twenty functional and eight non-functional requirements across five stakeholder types, including six specific authentication requirements (FR-14 to FR-19) and one auto-detection requirement (FR-20). The communication protocol was updated from Wi-Fi/MQTT to Bluetooth Low Energy (BLE), reflecting the supervisor's recommendation to remove the Wi-Fi dependency and enable monitoring anywhere within Bluetooth range. The security architecture utilises BLE pairing with bonding and link-layer encryption, Supabase row-level security, JWT session management, and HTTPS transport. The Agile development framework is maintained. Logical designs include an updated ERD, UI wireframes, and a Supabase database schema. Chapter 4 will present the physical implementation of these designs.</w:t>
       </w:r>
       <w:proofErr w:type="spellStart"/>
       <w:r/>
@@ -13184,7 +13184,7 @@
     <w:p>
       <w:pPr/>
       <w:r>
-        <w:t xml:space="preserve">The front-end, secured by Supabase Auth (email/password and Google OAuth), is deployed on GitHub Pages at https://faadila-wumpini.github.io/Engine_monitor/ and presents the live engine-monitor dashboard shown in Figure 4.3, including real-time vibration and temperature readings, the current anomaly score, and the anomaly threshold indicator bar. Because the site is published as a GitHub Pages project site rather than a user site, the /Engine_monitor/ path segment forms part of the canonical URL, and this full path must be registered both as the Site URL and in the redirect allow-list of the Supabase project for email-confirmation and OAuth redirects to resolve correctly.</w:t>
+        <w:t xml:space="preserve">The front-end, secured by Supabase Auth (email and password, with email confirmation and self-service password reset), is deployed on GitHub Pages at https://faadila-wumpini.github.io/Engine_monitor/ and presents the live engine-monitor dashboard shown in Figure 4.3, including real-time vibration and temperature readings, the current anomaly score, and the anomaly threshold indicator bar. Because the site is published as a GitHub Pages project site rather than a user site, the /Engine_monitor/ path segment forms part of the canonical URL, and this full path must be registered both as the Site URL and in the redirect allow-list of the Supabase project for email-confirmation and password-reset redirects to resolve correctly.</w:t>
       </w:r>
     </w:p>
     <w:p>
@@ -14100,7 +14100,7 @@
         </w:numPr>
       </w:pPr>
       <w:r>
-        <w:t>Supabase's combination of managed Postgres, row-level security, and built-in JWT/OAuth authentication proved sufficient to secure the dashboard and anomaly log without building a custom backend, keeping the project within a student timeline and a near-zero cloud budget.</w:t>
+        <w:t xml:space="preserve">Supabase's combination of managed Postgres, row-level security, and built-in JWT authentication and transactional email proved sufficient to secure the dashboard and anomaly log without building a custom backend, keeping the project within a student timeline and a near-zero cloud budget.</w:t>
       </w:r>
       <w:r/>
       <w:r/>

</xml_diff>